<commit_message>
chore: update output and documentation artifacts from latest pipeline run
Co-Authored-By: Claude Sonnet 4.6 <noreply@anthropic.com>
</commit_message>
<xml_diff>
--- a/docs/analysis.docx
+++ b/docs/analysis.docx
@@ -12,7 +12,7 @@
     </w:p>
     <w:p>
       <w:r>
-        <w:t>Generated: 2026-05-25T17:10:27.298113+00:00</w:t>
+        <w:t>Generated: 2026-05-29T14:46:15.480008+00:00</w:t>
       </w:r>
     </w:p>
     <w:p>
@@ -56,7 +56,7 @@
     </w:p>
     <w:p>
       <w:r>
-        <w:t>LLM usage this run: 14 API calls, 25897 tokens total (18113 input + 7784 output). Fallbacks triggered: 30.</w:t>
+        <w:t>LLM usage this run: 15 API calls, 31361 tokens total (20691 input + 10670 output). Fallbacks triggered: 18.</w:t>
       </w:r>
     </w:p>
     <w:p>

</xml_diff>